<commit_message>
Added replay protection unit test and updated report
</commit_message>
<xml_diff>
--- a/GAPT Report.docx
+++ b/GAPT Report.docx
@@ -21,7 +21,7 @@
           <w:szCs w:val="24"/>
         </w:rPr>
         <w:drawing>
-          <wp:inline distT="0" distB="0" distL="0" distR="0" wp14:anchorId="05F8E5B7" wp14:editId="5242456B">
+          <wp:inline distT="0" distB="0" distL="0" distR="0" wp14:anchorId="05F8E5B7" wp14:editId="0C346DBC">
             <wp:extent cx="4603005" cy="1008993"/>
             <wp:effectExtent l="0" t="0" r="0" b="0"/>
             <wp:docPr id="1" name="Picture 1" descr="Text&#10;&#10;Description automatically generated"/>
@@ -552,7 +552,6 @@
           <w:lang w:val="fr-FR"/>
         </w:rPr>
       </w:pPr>
-      <w:proofErr w:type="spellStart"/>
       <w:r>
         <w:rPr>
           <w:rFonts w:eastAsia="Times New Roman" w:cstheme="minorHAnsi"/>
@@ -560,17 +559,17 @@
           <w:szCs w:val="24"/>
           <w:lang w:val="fr-FR"/>
         </w:rPr>
-        <w:t>Lecturer</w:t>
-      </w:r>
-      <w:proofErr w:type="spellEnd"/>
-      <w:r>
-        <w:rPr>
-          <w:rFonts w:eastAsia="Times New Roman" w:cstheme="minorHAnsi"/>
+        <w:t xml:space="preserve">Lecturer: </w:t>
+      </w:r>
+      <w:r>
+        <w:rPr>
+          <w:rFonts w:eastAsia="Times New Roman" w:cstheme="minorHAnsi"/>
+          <w:b/>
           <w:sz w:val="24"/>
           <w:szCs w:val="24"/>
           <w:lang w:val="fr-FR"/>
         </w:rPr>
-        <w:t xml:space="preserve">: </w:t>
+        <w:t xml:space="preserve">Dr </w:t>
       </w:r>
       <w:r>
         <w:rPr>
@@ -580,41 +579,40 @@
           <w:szCs w:val="24"/>
           <w:lang w:val="fr-FR"/>
         </w:rPr>
-        <w:t xml:space="preserve">Dr </w:t>
-      </w:r>
-      <w:r>
-        <w:rPr>
-          <w:rFonts w:eastAsia="Times New Roman" w:cstheme="minorHAnsi"/>
-          <w:b/>
+        <w:t>Clyde Meli</w:t>
+      </w:r>
+    </w:p>
+    <w:p>
+      <w:pPr>
+        <w:rPr>
+          <w:rFonts w:eastAsia="Times New Roman" w:cstheme="minorHAnsi"/>
           <w:sz w:val="24"/>
           <w:szCs w:val="24"/>
           <w:lang w:val="fr-FR"/>
         </w:rPr>
-        <w:t>Clyde Meli</w:t>
-      </w:r>
-    </w:p>
-    <w:p>
-      <w:pPr>
+      </w:pPr>
+      <w:r>
         <w:rPr>
           <w:rFonts w:eastAsia="Times New Roman" w:cstheme="minorHAnsi"/>
           <w:sz w:val="24"/>
           <w:szCs w:val="24"/>
           <w:lang w:val="fr-FR"/>
         </w:rPr>
-      </w:pPr>
-      <w:r>
-        <w:rPr>
-          <w:rFonts w:eastAsia="Times New Roman" w:cstheme="minorHAnsi"/>
+        <w:br w:type="page"/>
+      </w:r>
+    </w:p>
+    <w:p>
+      <w:pPr>
+        <w:spacing w:line="240" w:lineRule="auto"/>
+        <w:rPr>
+          <w:rFonts w:eastAsia="Times New Roman" w:cstheme="minorHAnsi"/>
+          <w:b/>
+          <w:bCs/>
           <w:sz w:val="24"/>
           <w:szCs w:val="24"/>
-          <w:lang w:val="fr-FR"/>
-        </w:rPr>
-        <w:br w:type="page"/>
-      </w:r>
-    </w:p>
-    <w:p>
-      <w:pPr>
-        <w:spacing w:line="240" w:lineRule="auto"/>
+        </w:rPr>
+      </w:pPr>
+      <w:r>
         <w:rPr>
           <w:rFonts w:eastAsia="Times New Roman" w:cstheme="minorHAnsi"/>
           <w:b/>
@@ -622,18 +620,19 @@
           <w:sz w:val="24"/>
           <w:szCs w:val="24"/>
         </w:rPr>
-      </w:pPr>
-      <w:r>
-        <w:rPr>
-          <w:rFonts w:eastAsia="Times New Roman" w:cstheme="minorHAnsi"/>
-          <w:b/>
-          <w:bCs/>
+        <w:lastRenderedPageBreak/>
+        <w:t>FACULTY OF INFORMATION AND COMMUNICATION TECHNOLOGY</w:t>
+      </w:r>
+    </w:p>
+    <w:p>
+      <w:pPr>
+        <w:spacing w:line="240" w:lineRule="auto"/>
+        <w:rPr>
+          <w:rFonts w:eastAsia="Times New Roman" w:cstheme="minorHAnsi"/>
           <w:sz w:val="24"/>
           <w:szCs w:val="24"/>
         </w:rPr>
-        <w:lastRenderedPageBreak/>
-        <w:t>FACULTY OF INFORMATION AND COMMUNICATION TECHNOLOGY</w:t>
-      </w:r>
+      </w:pPr>
     </w:p>
     <w:p>
       <w:pPr>
@@ -644,40 +643,30 @@
           <w:szCs w:val="24"/>
         </w:rPr>
       </w:pPr>
-    </w:p>
-    <w:p>
-      <w:pPr>
-        <w:spacing w:line="240" w:lineRule="auto"/>
+      <w:r>
         <w:rPr>
           <w:rFonts w:eastAsia="Times New Roman" w:cstheme="minorHAnsi"/>
           <w:sz w:val="24"/>
           <w:szCs w:val="24"/>
         </w:rPr>
-      </w:pPr>
-      <w:r>
+        <w:t>Declaration</w:t>
+      </w:r>
+    </w:p>
+    <w:p>
+      <w:pPr>
+        <w:spacing w:line="240" w:lineRule="auto"/>
         <w:rPr>
           <w:rFonts w:eastAsia="Times New Roman" w:cstheme="minorHAnsi"/>
           <w:sz w:val="24"/>
           <w:szCs w:val="24"/>
         </w:rPr>
-        <w:t>Declaration</w:t>
-      </w:r>
+      </w:pPr>
     </w:p>
     <w:p>
       <w:pPr>
         <w:spacing w:line="240" w:lineRule="auto"/>
         <w:rPr>
           <w:rFonts w:eastAsia="Times New Roman" w:cstheme="minorHAnsi"/>
-          <w:sz w:val="24"/>
-          <w:szCs w:val="24"/>
-        </w:rPr>
-      </w:pPr>
-    </w:p>
-    <w:p>
-      <w:pPr>
-        <w:spacing w:line="240" w:lineRule="auto"/>
-        <w:rPr>
-          <w:rFonts w:eastAsia="Times New Roman" w:cstheme="minorHAnsi"/>
         </w:rPr>
       </w:pPr>
       <w:r>
@@ -697,21 +686,7 @@
         <w:rPr>
           <w:rFonts w:eastAsia="Times New Roman" w:cstheme="minorHAnsi"/>
         </w:rPr>
-        <w:t>, 2009, Regulation 39 (b)(</w:t>
-      </w:r>
-      <w:proofErr w:type="spellStart"/>
-      <w:r>
-        <w:rPr>
-          <w:rFonts w:eastAsia="Times New Roman" w:cstheme="minorHAnsi"/>
-        </w:rPr>
-        <w:t>i</w:t>
-      </w:r>
-      <w:proofErr w:type="spellEnd"/>
-      <w:r>
-        <w:rPr>
-          <w:rFonts w:eastAsia="Times New Roman" w:cstheme="minorHAnsi"/>
-        </w:rPr>
-        <w:t xml:space="preserve">), University of Malta). </w:t>
+        <w:t xml:space="preserve">, 2009, Regulation 39 (b)(i), University of Malta). </w:t>
       </w:r>
     </w:p>
     <w:p>
@@ -3671,21 +3646,7 @@
           <w:rFonts w:cstheme="minorHAnsi"/>
         </w:rPr>
         <w:br/>
-        <w:t xml:space="preserve">Simple </w:t>
-      </w:r>
-      <w:proofErr w:type="spellStart"/>
-      <w:r>
-        <w:rPr>
-          <w:rFonts w:cstheme="minorHAnsi"/>
-        </w:rPr>
-        <w:t>DirectMedia</w:t>
-      </w:r>
-      <w:proofErr w:type="spellEnd"/>
-      <w:r>
-        <w:rPr>
-          <w:rFonts w:cstheme="minorHAnsi"/>
-        </w:rPr>
-        <w:t xml:space="preserve"> Layer (SDL) is a cross-platform library used for handling graphics, input, and multimedia. It is widely used in game development due to its lightweight nature and ability to interact with OpenGL and DirectX.</w:t>
+        <w:t>Simple DirectMedia Layer (SDL) is a cross-platform library used for handling graphics, input, and multimedia. It is widely used in game development due to its lightweight nature and ability to interact with OpenGL and DirectX.</w:t>
       </w:r>
     </w:p>
     <w:p>
@@ -3742,35 +3703,7 @@
         <w:rPr>
           <w:rFonts w:cstheme="minorHAnsi"/>
         </w:rPr>
-        <w:t xml:space="preserve"> to draw objects efficiently using </w:t>
-      </w:r>
-      <w:proofErr w:type="spellStart"/>
-      <w:r>
-        <w:rPr>
-          <w:rFonts w:cstheme="minorHAnsi"/>
-        </w:rPr>
-        <w:t>SDL_RenderCopy</w:t>
-      </w:r>
-      <w:proofErr w:type="spellEnd"/>
-      <w:r>
-        <w:rPr>
-          <w:rFonts w:cstheme="minorHAnsi"/>
-        </w:rPr>
-        <w:t xml:space="preserve">(). Optimizing textures and using hardware acceleration (via </w:t>
-      </w:r>
-      <w:proofErr w:type="spellStart"/>
-      <w:r>
-        <w:rPr>
-          <w:rFonts w:cstheme="minorHAnsi"/>
-        </w:rPr>
-        <w:t>SDL_Renderer</w:t>
-      </w:r>
-      <w:proofErr w:type="spellEnd"/>
-      <w:r>
-        <w:rPr>
-          <w:rFonts w:cstheme="minorHAnsi"/>
-        </w:rPr>
-        <w:t>) is crucial for smooth animations.</w:t>
+        <w:t xml:space="preserve"> to draw objects efficiently using SDL_RenderCopy(). Optimizing textures and using hardware acceleration (via SDL_Renderer) is crucial for smooth animations.</w:t>
       </w:r>
     </w:p>
     <w:p>
@@ -3810,21 +3743,7 @@
         <w:rPr>
           <w:rFonts w:cstheme="minorHAnsi"/>
         </w:rPr>
-        <w:t xml:space="preserve">. SDL captures events using </w:t>
-      </w:r>
-      <w:proofErr w:type="spellStart"/>
-      <w:r>
-        <w:rPr>
-          <w:rFonts w:cstheme="minorHAnsi"/>
-        </w:rPr>
-        <w:t>SDL_PollEvent</w:t>
-      </w:r>
-      <w:proofErr w:type="spellEnd"/>
-      <w:r>
-        <w:rPr>
-          <w:rFonts w:cstheme="minorHAnsi"/>
-        </w:rPr>
-        <w:t>(), which can track mouse movement (SDL_MOUSEMOTION) and clicks (SDL_MOUSEBUTTONDOWN).</w:t>
+        <w:t>. SDL captures events using SDL_PollEvent(), which can track mouse movement (SDL_MOUSEMOTION) and clicks (SDL_MOUSEBUTTONDOWN).</w:t>
       </w:r>
     </w:p>
     <w:p>
@@ -3946,25 +3865,7 @@
           <w:b/>
           <w:bCs/>
         </w:rPr>
-        <w:t xml:space="preserve">SDL Documentation &amp; </w:t>
-      </w:r>
-      <w:proofErr w:type="spellStart"/>
-      <w:r>
-        <w:rPr>
-          <w:rFonts w:cstheme="minorHAnsi"/>
-          <w:b/>
-          <w:bCs/>
-        </w:rPr>
-        <w:t>LazyFoo</w:t>
-      </w:r>
-      <w:proofErr w:type="spellEnd"/>
-      <w:r>
-        <w:rPr>
-          <w:rFonts w:cstheme="minorHAnsi"/>
-          <w:b/>
-          <w:bCs/>
-        </w:rPr>
-        <w:t xml:space="preserve"> Tutorials</w:t>
+        <w:t>SDL Documentation &amp; LazyFoo Tutorials</w:t>
       </w:r>
       <w:r>
         <w:rPr>
@@ -3996,21 +3897,7 @@
         <w:rPr>
           <w:rFonts w:cstheme="minorHAnsi"/>
         </w:rPr>
-        <w:t>: Research shows that frame rate stability (60 FPS) enhances user experience, so delta time management (</w:t>
-      </w:r>
-      <w:proofErr w:type="spellStart"/>
-      <w:r>
-        <w:rPr>
-          <w:rFonts w:cstheme="minorHAnsi"/>
-        </w:rPr>
-        <w:t>SDL_GetTicks</w:t>
-      </w:r>
-      <w:proofErr w:type="spellEnd"/>
-      <w:r>
-        <w:rPr>
-          <w:rFonts w:cstheme="minorHAnsi"/>
-        </w:rPr>
-        <w:t>()) is essential.</w:t>
+        <w:t>: Research shows that frame rate stability (60 FPS) enhances user experience, so delta time management (SDL_GetTicks()) is essential.</w:t>
       </w:r>
     </w:p>
     <w:p>
@@ -4024,23 +3911,13 @@
           <w:rFonts w:cstheme="minorHAnsi"/>
         </w:rPr>
       </w:pPr>
-      <w:proofErr w:type="spellStart"/>
-      <w:r>
-        <w:rPr>
-          <w:rFonts w:cstheme="minorHAnsi"/>
-          <w:b/>
-          <w:bCs/>
-        </w:rPr>
-        <w:t>Gamasutra</w:t>
-      </w:r>
-      <w:proofErr w:type="spellEnd"/>
-      <w:r>
-        <w:rPr>
-          <w:rFonts w:cstheme="minorHAnsi"/>
-          <w:b/>
-          <w:bCs/>
-        </w:rPr>
-        <w:t xml:space="preserve"> Articles on UI/UX for Puzzle Games</w:t>
+      <w:r>
+        <w:rPr>
+          <w:rFonts w:cstheme="minorHAnsi"/>
+          <w:b/>
+          <w:bCs/>
+        </w:rPr>
+        <w:t>Gamasutra Articles on UI/UX for Puzzle Games</w:t>
       </w:r>
       <w:r>
         <w:rPr>
@@ -4559,25 +4436,7 @@
           <w:b/>
           <w:bCs/>
         </w:rPr>
-        <w:t xml:space="preserve">send() and </w:t>
-      </w:r>
-      <w:proofErr w:type="spellStart"/>
-      <w:r>
-        <w:rPr>
-          <w:rFonts w:cstheme="minorHAnsi"/>
-          <w:b/>
-          <w:bCs/>
-        </w:rPr>
-        <w:t>recv</w:t>
-      </w:r>
-      <w:proofErr w:type="spellEnd"/>
-      <w:r>
-        <w:rPr>
-          <w:rFonts w:cstheme="minorHAnsi"/>
-          <w:b/>
-          <w:bCs/>
-        </w:rPr>
-        <w:t>() functions</w:t>
+        <w:t>send() and recv() functions</w:t>
       </w:r>
       <w:r>
         <w:rPr>
@@ -5070,21 +4929,7 @@
         <w:rPr>
           <w:rFonts w:cstheme="minorHAnsi"/>
         </w:rPr>
-        <w:t xml:space="preserve">The server generates a sequence of random blocks which are then sent to the connected clients when a session starts upon request of a new block. The server stores a pointer for each client’s current </w:t>
-      </w:r>
-      <w:proofErr w:type="spellStart"/>
-      <w:r>
-        <w:rPr>
-          <w:rFonts w:cstheme="minorHAnsi"/>
-        </w:rPr>
-        <w:t>tetromino</w:t>
-      </w:r>
-      <w:proofErr w:type="spellEnd"/>
-      <w:r>
-        <w:rPr>
-          <w:rFonts w:cstheme="minorHAnsi"/>
-        </w:rPr>
-        <w:t xml:space="preserve"> and updates the pointer upon request from the client when a new block is needed.</w:t>
+        <w:t>The server generates a sequence of random blocks which are then sent to the connected clients when a session starts upon request of a new block. The server stores a pointer for each client’s current tetromino and updates the pointer upon request from the client when a new block is needed.</w:t>
       </w:r>
     </w:p>
     <w:p>
@@ -5147,7 +4992,6 @@
           <w:rFonts w:cstheme="minorHAnsi"/>
         </w:rPr>
       </w:pPr>
-      <w:proofErr w:type="spellStart"/>
       <w:r>
         <w:rPr>
           <w:rFonts w:cstheme="minorHAnsi"/>
@@ -5156,7 +5000,6 @@
         </w:rPr>
         <w:t>Cassert</w:t>
       </w:r>
-      <w:proofErr w:type="spellEnd"/>
       <w:r>
         <w:rPr>
           <w:rFonts w:cstheme="minorHAnsi"/>
@@ -5271,7 +5114,6 @@
         </w:rPr>
         <w:t xml:space="preserve">Profiling CPU/memory usage of the server using </w:t>
       </w:r>
-      <w:proofErr w:type="spellStart"/>
       <w:r>
         <w:rPr>
           <w:rFonts w:cstheme="minorHAnsi"/>
@@ -5280,7 +5122,6 @@
         </w:rPr>
         <w:t>Valgrind</w:t>
       </w:r>
-      <w:proofErr w:type="spellEnd"/>
       <w:r>
         <w:rPr>
           <w:rFonts w:cstheme="minorHAnsi"/>
@@ -5457,35 +5298,7 @@
           <w:rFonts w:cstheme="minorHAnsi"/>
         </w:rPr>
         <w:br/>
-        <w:t xml:space="preserve">Popular puzzle games like Tetris Blitz, </w:t>
-      </w:r>
-      <w:proofErr w:type="spellStart"/>
-      <w:r>
-        <w:rPr>
-          <w:rFonts w:cstheme="minorHAnsi"/>
-        </w:rPr>
-        <w:t>Blockudoku</w:t>
-      </w:r>
-      <w:proofErr w:type="spellEnd"/>
-      <w:r>
-        <w:rPr>
-          <w:rFonts w:cstheme="minorHAnsi"/>
-        </w:rPr>
-        <w:t xml:space="preserve">, and </w:t>
-      </w:r>
-      <w:proofErr w:type="spellStart"/>
-      <w:r>
-        <w:rPr>
-          <w:rFonts w:cstheme="minorHAnsi"/>
-        </w:rPr>
-        <w:t>Woodoku</w:t>
-      </w:r>
-      <w:proofErr w:type="spellEnd"/>
-      <w:r>
-        <w:rPr>
-          <w:rFonts w:cstheme="minorHAnsi"/>
-        </w:rPr>
-        <w:t xml:space="preserve"> feature intuitive, grid-based drag-and-drop gameplay. They rely on event-driven input (touch or mouse), precise collision detection, and snapping to grid cells to create a satisfying tactile feel. Combo systems that reward players for clearing multiple lines or completing consecutive objectives, like in Tetris Maximus, boost player engagement and encourage strategic play.</w:t>
+        <w:t>Popular puzzle games like Tetris Blitz, Blockudoku, and Woodoku feature intuitive, grid-based drag-and-drop gameplay. They rely on event-driven input (touch or mouse), precise collision detection, and snapping to grid cells to create a satisfying tactile feel. Combo systems that reward players for clearing multiple lines or completing consecutive objectives, like in Tetris Maximus, boost player engagement and encourage strategic play.</w:t>
       </w:r>
     </w:p>
     <w:p>
@@ -5509,35 +5322,7 @@
           <w:rFonts w:cstheme="minorHAnsi"/>
         </w:rPr>
         <w:br/>
-        <w:t xml:space="preserve">Games such as Tetris 99 and </w:t>
-      </w:r>
-      <w:proofErr w:type="spellStart"/>
-      <w:r>
-        <w:rPr>
-          <w:rFonts w:cstheme="minorHAnsi"/>
-        </w:rPr>
-        <w:t>Puyo</w:t>
-      </w:r>
-      <w:proofErr w:type="spellEnd"/>
-      <w:r>
-        <w:rPr>
-          <w:rFonts w:cstheme="minorHAnsi"/>
-        </w:rPr>
-        <w:t xml:space="preserve"> </w:t>
-      </w:r>
-      <w:proofErr w:type="spellStart"/>
-      <w:r>
-        <w:rPr>
-          <w:rFonts w:cstheme="minorHAnsi"/>
-        </w:rPr>
-        <w:t>Puyo</w:t>
-      </w:r>
-      <w:proofErr w:type="spellEnd"/>
-      <w:r>
-        <w:rPr>
-          <w:rFonts w:cstheme="minorHAnsi"/>
-        </w:rPr>
-        <w:t xml:space="preserve"> Tetris use dedicated servers to keep players in sync. Rather than sending full game states, they transmit lightweight event-based updates to reduce bandwidth. Lag compensation through server authority and client-side prediction helps smooth out delays, while timestamped or sequenced messages ensure fairness in high-speed, competitive environments.</w:t>
+        <w:t>Games such as Tetris 99 and Puyo Puyo Tetris use dedicated servers to keep players in sync. Rather than sending full game states, they transmit lightweight event-based updates to reduce bandwidth. Lag compensation through server authority and client-side prediction helps smooth out delays, while timestamped or sequenced messages ensure fairness in high-speed, competitive environments.</w:t>
       </w:r>
     </w:p>
     <w:p>
@@ -6020,23 +5805,13 @@
           <w:bCs/>
         </w:rPr>
       </w:pPr>
-      <w:proofErr w:type="spellStart"/>
-      <w:r>
-        <w:rPr>
-          <w:rFonts w:cstheme="minorHAnsi"/>
-          <w:b/>
-          <w:bCs/>
-        </w:rPr>
-        <w:t>Tetromino</w:t>
-      </w:r>
-      <w:proofErr w:type="spellEnd"/>
-      <w:r>
-        <w:rPr>
-          <w:rFonts w:cstheme="minorHAnsi"/>
-          <w:b/>
-          <w:bCs/>
-        </w:rPr>
-        <w:t xml:space="preserve"> Creation</w:t>
+      <w:r>
+        <w:rPr>
+          <w:rFonts w:cstheme="minorHAnsi"/>
+          <w:b/>
+          <w:bCs/>
+        </w:rPr>
+        <w:t>Tetromino Creation</w:t>
       </w:r>
     </w:p>
     <w:p>
@@ -6050,21 +5825,7 @@
         <w:rPr>
           <w:rFonts w:cstheme="minorHAnsi"/>
         </w:rPr>
-        <w:t xml:space="preserve">A structure that stores block structures, uses multiple blocks to form the </w:t>
-      </w:r>
-      <w:proofErr w:type="spellStart"/>
-      <w:r>
-        <w:rPr>
-          <w:rFonts w:cstheme="minorHAnsi"/>
-        </w:rPr>
-        <w:t>tetromino</w:t>
-      </w:r>
-      <w:proofErr w:type="spellEnd"/>
-      <w:r>
-        <w:rPr>
-          <w:rFonts w:cstheme="minorHAnsi"/>
-        </w:rPr>
-        <w:t xml:space="preserve"> shapes. Using blocks allowed for easier placement, out of bounds detection and clearing.</w:t>
+        <w:t>A structure that stores block structures, uses multiple blocks to form the tetromino shapes. Using blocks allowed for easier placement, out of bounds detection and clearing.</w:t>
       </w:r>
     </w:p>
     <w:p>
@@ -6084,23 +5845,13 @@
           <w:bCs/>
         </w:rPr>
       </w:pPr>
-      <w:proofErr w:type="spellStart"/>
-      <w:r>
-        <w:rPr>
-          <w:rFonts w:cstheme="minorHAnsi"/>
-          <w:b/>
-          <w:bCs/>
-        </w:rPr>
-        <w:t>Tetromino</w:t>
-      </w:r>
-      <w:proofErr w:type="spellEnd"/>
-      <w:r>
-        <w:rPr>
-          <w:rFonts w:cstheme="minorHAnsi"/>
-          <w:b/>
-          <w:bCs/>
-        </w:rPr>
-        <w:t xml:space="preserve"> </w:t>
+      <w:r>
+        <w:rPr>
+          <w:rFonts w:cstheme="minorHAnsi"/>
+          <w:b/>
+          <w:bCs/>
+        </w:rPr>
+        <w:t xml:space="preserve">Tetromino </w:t>
       </w:r>
       <w:r>
         <w:rPr>
@@ -6181,7 +5932,7 @@
       <w:r>
         <w:rPr>
           <w:rFonts w:cstheme="minorHAnsi"/>
-          <w:lang/>
+          <w:noProof/>
         </w:rPr>
         <w:drawing>
           <wp:inline distT="0" distB="0" distL="0" distR="0" wp14:anchorId="6A077539" wp14:editId="1AEEC1E2">
@@ -6239,30 +5990,19 @@
         <w:jc w:val="left"/>
         <w:rPr>
           <w:rFonts w:cstheme="minorHAnsi"/>
-          <w:lang/>
         </w:rPr>
       </w:pPr>
       <w:r>
         <w:t xml:space="preserve">Figure </w:t>
       </w:r>
-      <w:r>
-        <w:fldChar w:fldCharType="begin"/>
-      </w:r>
-      <w:r>
-        <w:instrText xml:space="preserve"> SEQ Figure \* ARABIC </w:instrText>
-      </w:r>
-      <w:r>
-        <w:fldChar w:fldCharType="separate"/>
-      </w:r>
-      <w:r>
-        <w:rPr>
-          <w:noProof/>
-        </w:rPr>
-        <w:t>1</w:t>
-      </w:r>
-      <w:r>
-        <w:fldChar w:fldCharType="end"/>
-      </w:r>
+      <w:fldSimple w:instr=" SEQ Figure \* ARABIC ">
+        <w:r>
+          <w:rPr>
+            <w:noProof/>
+          </w:rPr>
+          <w:t>1</w:t>
+        </w:r>
+      </w:fldSimple>
       <w:r>
         <w:t>Activity Diagram to show how shapes are generated by the server</w:t>
       </w:r>
@@ -6562,35 +6302,7 @@
         <w:rPr>
           <w:rFonts w:cstheme="minorHAnsi"/>
         </w:rPr>
-        <w:t xml:space="preserve">The game provides immersive audio when interacting with </w:t>
-      </w:r>
-      <w:proofErr w:type="spellStart"/>
-      <w:r>
-        <w:rPr>
-          <w:rFonts w:cstheme="minorHAnsi"/>
-        </w:rPr>
-        <w:t>Tetrominos</w:t>
-      </w:r>
-      <w:proofErr w:type="spellEnd"/>
-      <w:r>
-        <w:rPr>
-          <w:rFonts w:cstheme="minorHAnsi"/>
-        </w:rPr>
-        <w:t xml:space="preserve"> using </w:t>
-      </w:r>
-      <w:proofErr w:type="spellStart"/>
-      <w:r>
-        <w:rPr>
-          <w:rFonts w:cstheme="minorHAnsi"/>
-        </w:rPr>
-        <w:t>MiniAudio</w:t>
-      </w:r>
-      <w:proofErr w:type="spellEnd"/>
-      <w:r>
-        <w:rPr>
-          <w:rFonts w:cstheme="minorHAnsi"/>
-        </w:rPr>
-        <w:t xml:space="preserve"> as well as calming background music that fits with the theme. Effects such as Screen shake on certain events and input feedback.</w:t>
+        <w:t>The game provides immersive audio when interacting with Tetrominos using MiniAudio as well as calming background music that fits with the theme. Effects such as Screen shake on certain events and input feedback.</w:t>
       </w:r>
     </w:p>
     <w:p>
@@ -6718,41 +6430,13 @@
         <w:rPr>
           <w:rFonts w:cstheme="minorHAnsi"/>
         </w:rPr>
-        <w:t xml:space="preserve">Jake: </w:t>
-      </w:r>
-      <w:proofErr w:type="spellStart"/>
-      <w:r>
-        <w:rPr>
-          <w:rFonts w:cstheme="minorHAnsi"/>
-        </w:rPr>
-        <w:t>Tetromino</w:t>
-      </w:r>
-      <w:proofErr w:type="spellEnd"/>
-      <w:r>
-        <w:rPr>
-          <w:rFonts w:cstheme="minorHAnsi"/>
-        </w:rPr>
-        <w:t xml:space="preserve"> mechanics, spawning/placement logic,</w:t>
-      </w:r>
-      <w:r>
-        <w:rPr>
-          <w:rFonts w:cstheme="minorHAnsi"/>
-        </w:rPr>
-        <w:t xml:space="preserve"> </w:t>
-      </w:r>
-      <w:proofErr w:type="spellStart"/>
-      <w:r>
-        <w:rPr>
-          <w:rFonts w:cstheme="minorHAnsi"/>
-        </w:rPr>
-        <w:t>Tetromino</w:t>
-      </w:r>
-      <w:proofErr w:type="spellEnd"/>
-      <w:r>
-        <w:rPr>
-          <w:rFonts w:cstheme="minorHAnsi"/>
-        </w:rPr>
-        <w:t xml:space="preserve"> bug fixes,</w:t>
+        <w:t>Jake: Tetromino mechanics, spawning/placement logic,</w:t>
+      </w:r>
+      <w:r>
+        <w:rPr>
+          <w:rFonts w:cstheme="minorHAnsi"/>
+        </w:rPr>
+        <w:t xml:space="preserve"> Tetromino bug fixes,</w:t>
       </w:r>
       <w:r>
         <w:rPr>
@@ -6860,21 +6544,7 @@
         <w:rPr>
           <w:rFonts w:cstheme="minorHAnsi"/>
         </w:rPr>
-        <w:t xml:space="preserve"> the Agile development methodology, adopting the Scrum framework to facilitate iterative development and continuous improvement. </w:t>
-      </w:r>
-      <w:proofErr w:type="spellStart"/>
-      <w:r>
-        <w:rPr>
-          <w:rFonts w:cstheme="minorHAnsi"/>
-        </w:rPr>
-        <w:t>Agile’s</w:t>
-      </w:r>
-      <w:proofErr w:type="spellEnd"/>
-      <w:r>
-        <w:rPr>
-          <w:rFonts w:cstheme="minorHAnsi"/>
-        </w:rPr>
-        <w:t xml:space="preserve"> emphasis on flexibility, collaboration, and incremental progress aligns well with the dynamic nature of game development and the evolving requirements of a multiplayer system.</w:t>
+        <w:t xml:space="preserve"> the Agile development methodology, adopting the Scrum framework to facilitate iterative development and continuous improvement. Agile’s emphasis on flexibility, collaboration, and incremental progress aligns well with the dynamic nature of game development and the evolving requirements of a multiplayer system.</w:t>
       </w:r>
     </w:p>
     <w:p>
@@ -7332,21 +7002,7 @@
         <w:rPr>
           <w:rFonts w:cstheme="minorHAnsi"/>
         </w:rPr>
-        <w:t>All client–server exchanges use concise JSON messages carrying session and player IDs, action or event types, payload, timestamp, and HMAC. In memory, each ‘</w:t>
-      </w:r>
-      <w:proofErr w:type="spellStart"/>
-      <w:r>
-        <w:rPr>
-          <w:rFonts w:cstheme="minorHAnsi"/>
-        </w:rPr>
-        <w:t>SessionState</w:t>
-      </w:r>
-      <w:proofErr w:type="spellEnd"/>
-      <w:r>
-        <w:rPr>
-          <w:rFonts w:cstheme="minorHAnsi"/>
-        </w:rPr>
-        <w:t xml:space="preserve">’ holds the 9×9 grid, player-specific state (current piece, score, connection flag), and a countdown timer. </w:t>
+        <w:t xml:space="preserve">All client–server exchanges use concise JSON messages carrying session and player IDs, action or event types, payload, timestamp, and HMAC. In memory, each ‘SessionState’ holds the 9×9 grid, player-specific state (current piece, score, connection flag), and a countdown timer. </w:t>
       </w:r>
     </w:p>
     <w:p>
@@ -7385,49 +7041,7 @@
         <w:rPr>
           <w:rFonts w:cstheme="minorHAnsi"/>
         </w:rPr>
-        <w:t xml:space="preserve">We target a small VPS (2 vCPU, 4 GB RAM) with auto-scaling. SDL3 (plus </w:t>
-      </w:r>
-      <w:proofErr w:type="spellStart"/>
-      <w:r>
-        <w:rPr>
-          <w:rFonts w:cstheme="minorHAnsi"/>
-        </w:rPr>
-        <w:t>SDL_image</w:t>
-      </w:r>
-      <w:proofErr w:type="spellEnd"/>
-      <w:r>
-        <w:rPr>
-          <w:rFonts w:cstheme="minorHAnsi"/>
-        </w:rPr>
-        <w:t xml:space="preserve"> and </w:t>
-      </w:r>
-      <w:proofErr w:type="spellStart"/>
-      <w:r>
-        <w:rPr>
-          <w:rFonts w:cstheme="minorHAnsi"/>
-        </w:rPr>
-        <w:t>SDL_ttf</w:t>
-      </w:r>
-      <w:proofErr w:type="spellEnd"/>
-      <w:r>
-        <w:rPr>
-          <w:rFonts w:cstheme="minorHAnsi"/>
-        </w:rPr>
-        <w:t xml:space="preserve">) and </w:t>
-      </w:r>
-      <w:proofErr w:type="spellStart"/>
-      <w:r>
-        <w:rPr>
-          <w:rFonts w:cstheme="minorHAnsi"/>
-        </w:rPr>
-        <w:t>MiniAudio</w:t>
-      </w:r>
-      <w:proofErr w:type="spellEnd"/>
-      <w:r>
-        <w:rPr>
-          <w:rFonts w:cstheme="minorHAnsi"/>
-        </w:rPr>
-        <w:t xml:space="preserve"> drive the client, while native sockets and OpenSSL are used to secure networking. </w:t>
+        <w:t xml:space="preserve">We target a small VPS (2 vCPU, 4 GB RAM) with auto-scaling. SDL3 (plus SDL_image and SDL_ttf) and MiniAudio drive the client, while native sockets and OpenSSL are used to secure networking. </w:t>
       </w:r>
     </w:p>
     <w:p>
@@ -7502,21 +7116,7 @@
         <w:rPr>
           <w:rFonts w:cstheme="minorHAnsi"/>
         </w:rPr>
-        <w:t xml:space="preserve"> and a side bar (available </w:t>
-      </w:r>
-      <w:proofErr w:type="spellStart"/>
-      <w:r>
-        <w:rPr>
-          <w:rFonts w:cstheme="minorHAnsi"/>
-        </w:rPr>
-        <w:t>tetrominos</w:t>
-      </w:r>
-      <w:proofErr w:type="spellEnd"/>
-      <w:r>
-        <w:rPr>
-          <w:rFonts w:cstheme="minorHAnsi"/>
-        </w:rPr>
-        <w:t>)</w:t>
+        <w:t xml:space="preserve"> and a side bar (available tetrominos)</w:t>
       </w:r>
       <w:r>
         <w:rPr>
@@ -7662,7 +7262,6 @@
           <w:rFonts w:cstheme="minorHAnsi"/>
           <w:bCs/>
           <w:szCs w:val="12"/>
-          <w:lang/>
         </w:rPr>
       </w:pPr>
       <w:r>
@@ -7671,7 +7270,6 @@
           <w:b/>
           <w:bCs/>
           <w:szCs w:val="12"/>
-          <w:lang/>
         </w:rPr>
         <w:t>Client-Server Architecture</w:t>
       </w:r>
@@ -7680,7 +7278,6 @@
           <w:rFonts w:cstheme="minorHAnsi"/>
           <w:bCs/>
           <w:szCs w:val="12"/>
-          <w:lang/>
         </w:rPr>
         <w:t>: Achieved real-time synchronization using TCP for critical events and UDP for lightweight state updates.</w:t>
       </w:r>
@@ -7697,7 +7294,6 @@
           <w:rFonts w:cstheme="minorHAnsi"/>
           <w:bCs/>
           <w:szCs w:val="12"/>
-          <w:lang/>
         </w:rPr>
       </w:pPr>
       <w:r>
@@ -7706,7 +7302,6 @@
           <w:b/>
           <w:bCs/>
           <w:szCs w:val="12"/>
-          <w:lang/>
         </w:rPr>
         <w:t>Puzzle Gameplay</w:t>
       </w:r>
@@ -7715,7 +7310,6 @@
           <w:rFonts w:cstheme="minorHAnsi"/>
           <w:bCs/>
           <w:szCs w:val="12"/>
-          <w:lang/>
         </w:rPr>
         <w:t>: SDL was used to render a responsive 9×9 grid with drag-and-drop support, grid snapping, and row/column clearing mechanics.</w:t>
       </w:r>
@@ -7732,7 +7326,6 @@
           <w:rFonts w:cstheme="minorHAnsi"/>
           <w:bCs/>
           <w:szCs w:val="12"/>
-          <w:lang/>
         </w:rPr>
       </w:pPr>
       <w:r>
@@ -7741,7 +7334,6 @@
           <w:b/>
           <w:bCs/>
           <w:szCs w:val="12"/>
-          <w:lang/>
         </w:rPr>
         <w:t>Multiplayer Matchmaking</w:t>
       </w:r>
@@ -7750,7 +7342,6 @@
           <w:rFonts w:cstheme="minorHAnsi"/>
           <w:bCs/>
           <w:szCs w:val="12"/>
-          <w:lang/>
         </w:rPr>
         <w:t>: Clients automatically discover servers and are matched into games with synchronized timers and block distribution.</w:t>
       </w:r>
@@ -7767,7 +7358,6 @@
           <w:rFonts w:cstheme="minorHAnsi"/>
           <w:bCs/>
           <w:szCs w:val="12"/>
-          <w:lang/>
         </w:rPr>
       </w:pPr>
       <w:r>
@@ -7776,7 +7366,6 @@
           <w:b/>
           <w:bCs/>
           <w:szCs w:val="12"/>
-          <w:lang/>
         </w:rPr>
         <w:t>Security</w:t>
       </w:r>
@@ -7785,7 +7374,6 @@
           <w:rFonts w:cstheme="minorHAnsi"/>
           <w:bCs/>
           <w:szCs w:val="12"/>
-          <w:lang/>
         </w:rPr>
         <w:t>: All packets are signed with HMAC and validated server-side. Replay attacks are mitigated via timestamped, unique identifiers.</w:t>
       </w:r>
@@ -7802,7 +7390,6 @@
           <w:rFonts w:cstheme="minorHAnsi"/>
           <w:bCs/>
           <w:szCs w:val="12"/>
-          <w:lang/>
         </w:rPr>
       </w:pPr>
       <w:r>
@@ -7811,7 +7398,6 @@
           <w:b/>
           <w:bCs/>
           <w:szCs w:val="12"/>
-          <w:lang/>
         </w:rPr>
         <w:t>Procedural Generation</w:t>
       </w:r>
@@ -7820,7 +7406,6 @@
           <w:rFonts w:cstheme="minorHAnsi"/>
           <w:bCs/>
           <w:szCs w:val="12"/>
-          <w:lang/>
         </w:rPr>
         <w:t>: Tetromino sequences are generated fairly using a bag system, ensuring balanced difficulty across players.</w:t>
       </w:r>
@@ -7837,7 +7422,6 @@
           <w:rFonts w:cstheme="minorHAnsi"/>
           <w:bCs/>
           <w:szCs w:val="12"/>
-          <w:lang/>
         </w:rPr>
       </w:pPr>
       <w:r>
@@ -7846,7 +7430,6 @@
           <w:b/>
           <w:bCs/>
           <w:szCs w:val="12"/>
-          <w:lang/>
         </w:rPr>
         <w:t>User Interface</w:t>
       </w:r>
@@ -7855,7 +7438,6 @@
           <w:rFonts w:cstheme="minorHAnsi"/>
           <w:bCs/>
           <w:szCs w:val="12"/>
-          <w:lang/>
         </w:rPr>
         <w:t>: Menus, scores, and in-game feedback were implemented with intuitive layouts and responsive controls.</w:t>
       </w:r>
@@ -7930,43 +7512,7 @@
           <w:bCs/>
           <w:szCs w:val="12"/>
         </w:rPr>
-        <w:t>Microsoft Unit Testing and Google Unit Testing Frameworks were not working, so we decided to use a “</w:t>
-      </w:r>
-      <w:proofErr w:type="spellStart"/>
-      <w:r>
-        <w:rPr>
-          <w:rFonts w:cstheme="minorHAnsi"/>
-          <w:bCs/>
-          <w:szCs w:val="12"/>
-        </w:rPr>
-        <w:t>Cassert</w:t>
-      </w:r>
-      <w:proofErr w:type="spellEnd"/>
-      <w:r>
-        <w:rPr>
-          <w:rFonts w:cstheme="minorHAnsi"/>
-          <w:bCs/>
-          <w:szCs w:val="12"/>
-        </w:rPr>
-        <w:t>” library to perform the tests. “</w:t>
-      </w:r>
-      <w:proofErr w:type="spellStart"/>
-      <w:r>
-        <w:rPr>
-          <w:rFonts w:cstheme="minorHAnsi"/>
-          <w:bCs/>
-          <w:szCs w:val="12"/>
-        </w:rPr>
-        <w:t>Cassert</w:t>
-      </w:r>
-      <w:proofErr w:type="spellEnd"/>
-      <w:r>
-        <w:rPr>
-          <w:rFonts w:cstheme="minorHAnsi"/>
-          <w:bCs/>
-          <w:szCs w:val="12"/>
-        </w:rPr>
-        <w:t xml:space="preserve">” works identically to the existing frameworks mentioned. </w:t>
+        <w:t xml:space="preserve">Microsoft Unit Testing and Google Unit Testing Frameworks were not working, so we decided to use a “Cassert” library to perform the tests. “Cassert” works identically to the existing frameworks mentioned. </w:t>
       </w:r>
       <w:r>
         <w:rPr>
@@ -8005,7 +7551,31 @@
           <w:bCs/>
           <w:szCs w:val="12"/>
         </w:rPr>
-        <w:t>Tested hover states for main menu to make sure mouse hovering and clicking works correctly.</w:t>
+        <w:t>T</w:t>
+      </w:r>
+      <w:r>
+        <w:rPr>
+          <w:rFonts w:cstheme="minorHAnsi"/>
+          <w:bCs/>
+          <w:szCs w:val="12"/>
+        </w:rPr>
+        <w:t>he main menu</w:t>
+      </w:r>
+      <w:r>
+        <w:rPr>
+          <w:rFonts w:cstheme="minorHAnsi"/>
+          <w:bCs/>
+          <w:szCs w:val="12"/>
+        </w:rPr>
+        <w:t xml:space="preserve"> was tested</w:t>
+      </w:r>
+      <w:r>
+        <w:rPr>
+          <w:rFonts w:cstheme="minorHAnsi"/>
+          <w:bCs/>
+          <w:szCs w:val="12"/>
+        </w:rPr>
+        <w:t xml:space="preserve"> by iterating over every menu item, simulating the position of the mouse to be within the rectangle of each item. This verifies that the hover-detection logic of isMouseOver correctly flags a point that is strictly inside the rectangle.</w:t>
       </w:r>
     </w:p>
     <w:p>
@@ -8036,7 +7606,7 @@
           <w:bCs/>
           <w:szCs w:val="12"/>
         </w:rPr>
-        <w:t>Collision testing v</w:t>
+        <w:t>Three puzzle logic unit tests were conducted for collision, position and grid bounds. C</w:t>
       </w:r>
       <w:r>
         <w:rPr>
@@ -8044,6 +7614,30 @@
           <w:bCs/>
           <w:szCs w:val="12"/>
         </w:rPr>
+        <w:t>ollision testing</w:t>
+      </w:r>
+      <w:r>
+        <w:rPr>
+          <w:rFonts w:cstheme="minorHAnsi"/>
+          <w:bCs/>
+          <w:szCs w:val="12"/>
+        </w:rPr>
+        <w:t xml:space="preserve"> for tetrominos encompasses a number of scenarios. An empty grid is created and a test tetromino is added, asserting no collision. A tetromino is placed at a specific overlapping grid cell, overlapping another and asserting a collision. The test piece is moved away and asserts no collision. And finally positioning it close but not overlapping the edge, this asserts an edge case collision. </w:t>
+      </w:r>
+      <w:r>
+        <w:rPr>
+          <w:rFonts w:cstheme="minorHAnsi"/>
+          <w:bCs/>
+          <w:szCs w:val="12"/>
+        </w:rPr>
+        <w:t xml:space="preserve"> v</w:t>
+      </w:r>
+      <w:r>
+        <w:rPr>
+          <w:rFonts w:cstheme="minorHAnsi"/>
+          <w:bCs/>
+          <w:szCs w:val="12"/>
+        </w:rPr>
         <w:t xml:space="preserve">erifies </w:t>
       </w:r>
       <w:r>
@@ -8052,25 +7646,120 @@
           <w:bCs/>
           <w:szCs w:val="12"/>
         </w:rPr>
-        <w:t xml:space="preserve">that block-collision behaves correctly in both normal and edge case scenarios. Position testing protects against spawning </w:t>
-      </w:r>
-      <w:proofErr w:type="spellStart"/>
+        <w:t xml:space="preserve">that block-collision behaves correctly in both normal and edge case scenarios. </w:t>
+      </w:r>
       <w:r>
         <w:rPr>
           <w:rFonts w:cstheme="minorHAnsi"/>
           <w:bCs/>
           <w:szCs w:val="12"/>
         </w:rPr>
-        <w:t>tetrominos</w:t>
-      </w:r>
-      <w:proofErr w:type="spellEnd"/>
+        <w:t>The p</w:t>
+      </w:r>
       <w:r>
         <w:rPr>
           <w:rFonts w:cstheme="minorHAnsi"/>
           <w:bCs/>
           <w:szCs w:val="12"/>
         </w:rPr>
-        <w:t xml:space="preserve"> into already occupied spaces, and grid testing prevents pieces from drifting off from the play area and catches out of bounds errors.</w:t>
+        <w:t>osition</w:t>
+      </w:r>
+      <w:r>
+        <w:rPr>
+          <w:rFonts w:cstheme="minorHAnsi"/>
+          <w:bCs/>
+          <w:szCs w:val="12"/>
+        </w:rPr>
+        <w:t xml:space="preserve"> unit test clears the global tetrominos pool and pushes shapes that do and do not conflict with the spawn coordinates, expecting the corresponding IsPositionFree state. Position t</w:t>
+      </w:r>
+      <w:r>
+        <w:rPr>
+          <w:rFonts w:cstheme="minorHAnsi"/>
+          <w:bCs/>
+          <w:szCs w:val="12"/>
+        </w:rPr>
+        <w:t>esting protects against spawning</w:t>
+      </w:r>
+      <w:r>
+        <w:rPr>
+          <w:rFonts w:cstheme="minorHAnsi"/>
+          <w:bCs/>
+          <w:szCs w:val="12"/>
+        </w:rPr>
+        <w:t xml:space="preserve"> the </w:t>
+      </w:r>
+      <w:r>
+        <w:rPr>
+          <w:rFonts w:cstheme="minorHAnsi"/>
+          <w:bCs/>
+          <w:szCs w:val="12"/>
+        </w:rPr>
+        <w:t>four-block</w:t>
+      </w:r>
+      <w:r>
+        <w:rPr>
+          <w:rFonts w:cstheme="minorHAnsi"/>
+          <w:bCs/>
+          <w:szCs w:val="12"/>
+        </w:rPr>
+        <w:t xml:space="preserve"> coordinate</w:t>
+      </w:r>
+      <w:r>
+        <w:rPr>
+          <w:rFonts w:cstheme="minorHAnsi"/>
+          <w:bCs/>
+          <w:szCs w:val="12"/>
+        </w:rPr>
+        <w:t xml:space="preserve"> tetrominos into already occupied spaces</w:t>
+      </w:r>
+      <w:r>
+        <w:rPr>
+          <w:rFonts w:cstheme="minorHAnsi"/>
+          <w:bCs/>
+          <w:szCs w:val="12"/>
+        </w:rPr>
+        <w:t xml:space="preserve"> </w:t>
+      </w:r>
+      <w:r>
+        <w:rPr>
+          <w:rFonts w:cstheme="minorHAnsi"/>
+          <w:bCs/>
+          <w:szCs w:val="12"/>
+        </w:rPr>
+        <w:t>and grid testing prevents pieces from drifting off from the play area and catches out of bounds errors.</w:t>
+      </w:r>
+      <w:r>
+        <w:rPr>
+          <w:rFonts w:cstheme="minorHAnsi"/>
+          <w:bCs/>
+          <w:szCs w:val="12"/>
+        </w:rPr>
+        <w:t xml:space="preserve"> </w:t>
+      </w:r>
+      <w:r>
+        <w:rPr>
+          <w:rFonts w:cstheme="minorHAnsi"/>
+          <w:bCs/>
+          <w:szCs w:val="12"/>
+        </w:rPr>
+        <w:t xml:space="preserve">Finally, the grid </w:t>
+      </w:r>
+      <w:r>
+        <w:rPr>
+          <w:rFonts w:cstheme="minorHAnsi"/>
+          <w:bCs/>
+          <w:szCs w:val="12"/>
+        </w:rPr>
+        <w:lastRenderedPageBreak/>
+        <w:t xml:space="preserve">bounds testing </w:t>
+      </w:r>
+      <w:r>
+        <w:rPr>
+          <w:rFonts w:cstheme="minorHAnsi"/>
+          <w:bCs/>
+          <w:szCs w:val="12"/>
+        </w:rPr>
+        <w:t>constructs tetrominos at various positions. It asserts true for tetrominos inside the grid and false for tetrominos that are both partly and fully outside the grid. Grid boundary testing is essential as it ensures that piece-placement logic correctly rejects illegal moves.</w:t>
       </w:r>
     </w:p>
     <w:p>
@@ -8109,7 +7798,7 @@
           <w:bCs/>
           <w:szCs w:val="12"/>
         </w:rPr>
-        <w:t>Testing HMAC security methods verifies that the hash matches OPENSSL’s output exactly</w:t>
+        <w:t>HMAC security</w:t>
       </w:r>
       <w:r>
         <w:rPr>
@@ -8117,7 +7806,111 @@
           <w:bCs/>
           <w:szCs w:val="12"/>
         </w:rPr>
-        <w:t>, ensures that no false positive or negatives occur and protects against tampering and replay.</w:t>
+        <w:t xml:space="preserve"> testing is essential to ensure that the security integrity of the game is not compromised. Three HMAC testing</w:t>
+      </w:r>
+      <w:r>
+        <w:rPr>
+          <w:rFonts w:cstheme="minorHAnsi"/>
+          <w:bCs/>
+          <w:szCs w:val="12"/>
+        </w:rPr>
+        <w:t xml:space="preserve"> methods </w:t>
+      </w:r>
+      <w:r>
+        <w:rPr>
+          <w:rFonts w:cstheme="minorHAnsi"/>
+          <w:bCs/>
+          <w:szCs w:val="12"/>
+        </w:rPr>
+        <w:t xml:space="preserve">were created for: ComputeHMAC, hmacEquals and validateHMAC. The first </w:t>
+      </w:r>
+      <w:r>
+        <w:rPr>
+          <w:rFonts w:cstheme="minorHAnsi"/>
+          <w:bCs/>
+          <w:szCs w:val="12"/>
+        </w:rPr>
+        <w:t>verifies that the hash matches OPENSSL’s output exactly</w:t>
+      </w:r>
+      <w:r>
+        <w:rPr>
+          <w:rFonts w:cstheme="minorHAnsi"/>
+          <w:bCs/>
+          <w:szCs w:val="12"/>
+        </w:rPr>
+        <w:t xml:space="preserve">, </w:t>
+      </w:r>
+      <w:r>
+        <w:rPr>
+          <w:rFonts w:cstheme="minorHAnsi"/>
+          <w:bCs/>
+          <w:szCs w:val="12"/>
+        </w:rPr>
+        <w:t>this guarantees that security primitives are correct before building atop them.</w:t>
+      </w:r>
+      <w:r>
+        <w:rPr>
+          <w:rFonts w:cstheme="minorHAnsi"/>
+          <w:bCs/>
+          <w:szCs w:val="12"/>
+        </w:rPr>
+        <w:t xml:space="preserve"> The second checks for different combinations of tags; where identical tags assert true</w:t>
+      </w:r>
+      <w:r>
+        <w:rPr>
+          <w:rFonts w:cstheme="minorHAnsi"/>
+          <w:bCs/>
+          <w:szCs w:val="12"/>
+        </w:rPr>
+        <w:t>, tags with a single bit difference assert false and tags with different lengths also assert false.</w:t>
+      </w:r>
+      <w:r>
+        <w:rPr>
+          <w:rFonts w:cstheme="minorHAnsi"/>
+          <w:bCs/>
+          <w:szCs w:val="12"/>
+        </w:rPr>
+        <w:t xml:space="preserve"> Timing-safe equality is important in order to avoid side-channel leaks.</w:t>
+      </w:r>
+      <w:r>
+        <w:rPr>
+          <w:rFonts w:cstheme="minorHAnsi"/>
+          <w:bCs/>
+          <w:szCs w:val="12"/>
+        </w:rPr>
+        <w:t xml:space="preserve"> Finally, validateHMAC tests for a missing </w:t>
+      </w:r>
+      <w:r>
+        <w:rPr>
+          <w:rFonts w:cstheme="minorHAnsi"/>
+          <w:bCs/>
+          <w:szCs w:val="12"/>
+        </w:rPr>
+        <w:t>HMAC</w:t>
+      </w:r>
+      <w:r>
+        <w:rPr>
+          <w:rFonts w:cstheme="minorHAnsi"/>
+          <w:bCs/>
+          <w:szCs w:val="12"/>
+        </w:rPr>
+        <w:t xml:space="preserve"> tag and returns false leaving data unchanged, a correct tag which attaches a valid HMAC over the payload and asserting true before removing the </w:t>
+      </w:r>
+      <w:r>
+        <w:rPr>
+          <w:rFonts w:cstheme="minorHAnsi"/>
+          <w:bCs/>
+          <w:szCs w:val="12"/>
+        </w:rPr>
+        <w:t>HMAC</w:t>
+      </w:r>
+      <w:r>
+        <w:rPr>
+          <w:rFonts w:cstheme="minorHAnsi"/>
+          <w:bCs/>
+          <w:szCs w:val="12"/>
+        </w:rPr>
+        <w:t xml:space="preserve"> tag after verification. And thirdly, it attaches a false 64 character and expects false. The validation tests cover acceptance, rejection and cleanup semantics for the message integrity checks. </w:t>
       </w:r>
     </w:p>
     <w:p>
@@ -8148,7 +7941,95 @@
           <w:bCs/>
           <w:szCs w:val="12"/>
         </w:rPr>
-        <w:t>Multiplayer testing verifies pairing logic under real concurrency, guaranteeing the two clients will reliably sync and that the atomic shutdown flag will break out of long-running loops.</w:t>
+        <w:t>Multiplayer testing verifies pairing logic</w:t>
+      </w:r>
+      <w:r>
+        <w:rPr>
+          <w:rFonts w:cstheme="minorHAnsi"/>
+          <w:bCs/>
+          <w:szCs w:val="12"/>
+        </w:rPr>
+        <w:t>, client state resetting and broadcast flag halting</w:t>
+      </w:r>
+      <w:r>
+        <w:rPr>
+          <w:rFonts w:cstheme="minorHAnsi"/>
+          <w:bCs/>
+          <w:szCs w:val="12"/>
+        </w:rPr>
+        <w:t xml:space="preserve"> under real concurrency</w:t>
+      </w:r>
+      <w:r>
+        <w:rPr>
+          <w:rFonts w:cstheme="minorHAnsi"/>
+          <w:bCs/>
+          <w:szCs w:val="12"/>
+        </w:rPr>
+        <w:t>. The pairing sync test clears shared waitingClients and pairingMap then launched two threads and after both join, it asserts that each saw the ID and socket of the other.</w:t>
+      </w:r>
+      <w:r>
+        <w:rPr>
+          <w:rFonts w:cstheme="minorHAnsi"/>
+          <w:bCs/>
+          <w:szCs w:val="12"/>
+        </w:rPr>
+        <w:t xml:space="preserve"> The resetClientState test intentionally corrupts every relevant field in the Client namespace and resets all the relevant fields, then asserts that each field is back to its default or empty state</w:t>
+      </w:r>
+      <w:r>
+        <w:rPr>
+          <w:rFonts w:cstheme="minorHAnsi"/>
+          <w:bCs/>
+          <w:szCs w:val="12"/>
+        </w:rPr>
+        <w:t>.</w:t>
+      </w:r>
+      <w:r>
+        <w:rPr>
+          <w:rFonts w:cstheme="minorHAnsi"/>
+          <w:bCs/>
+          <w:szCs w:val="12"/>
+        </w:rPr>
+        <w:t xml:space="preserve"> </w:t>
+      </w:r>
+      <w:r>
+        <w:rPr>
+          <w:rFonts w:cstheme="minorHAnsi"/>
+          <w:bCs/>
+          <w:szCs w:val="12"/>
+        </w:rPr>
+        <w:t>Finally,</w:t>
+      </w:r>
+      <w:r>
+        <w:rPr>
+          <w:rFonts w:cstheme="minorHAnsi"/>
+          <w:bCs/>
+          <w:szCs w:val="12"/>
+        </w:rPr>
+        <w:t xml:space="preserve"> the stopBroadcast_flag test creates a thread that spins until stopBroadcast becomes true, then verifies the thread is still running after a brief delay and sets stopBroadcast to true, waits for a join and asserts the thread exited.</w:t>
+      </w:r>
+      <w:r>
+        <w:rPr>
+          <w:rFonts w:cstheme="minorHAnsi"/>
+          <w:bCs/>
+          <w:szCs w:val="12"/>
+        </w:rPr>
+        <w:t xml:space="preserve"> </w:t>
+      </w:r>
+      <w:r>
+        <w:rPr>
+          <w:rFonts w:cstheme="minorHAnsi"/>
+          <w:bCs/>
+          <w:szCs w:val="12"/>
+        </w:rPr>
+        <w:t>These tests guarantee that the two clients will reliably sync, and that the atomic shutdown flag will break out of long-running loops</w:t>
+      </w:r>
+      <w:r>
+        <w:rPr>
+          <w:rFonts w:cstheme="minorHAnsi"/>
+          <w:bCs/>
+          <w:szCs w:val="12"/>
+        </w:rPr>
+        <w:t>.</w:t>
       </w:r>
     </w:p>
     <w:p>
@@ -8179,7 +8060,7 @@
           <w:bCs/>
           <w:szCs w:val="12"/>
         </w:rPr>
-        <w:t xml:space="preserve">  Testing for packet loss and variable jitter is important because it verifies that player clients can cope with packet loss by retransmitting until delivery and can reassemble out of order deliveries correctly which is crucial under real world</w:t>
+        <w:t xml:space="preserve">  Testing for packet loss and variable jitter is important </w:t>
       </w:r>
       <w:r>
         <w:rPr>
@@ -8187,6 +8068,22 @@
           <w:bCs/>
           <w:szCs w:val="12"/>
         </w:rPr>
+        <w:t>that</w:t>
+      </w:r>
+      <w:r>
+        <w:rPr>
+          <w:rFonts w:cstheme="minorHAnsi"/>
+          <w:bCs/>
+          <w:szCs w:val="12"/>
+        </w:rPr>
+        <w:t xml:space="preserve"> it verifies that player clients can cope with packet loss by retransmitting until delivery and can reassemble out of order deliveries correctly which is crucial under real world</w:t>
+      </w:r>
+      <w:r>
+        <w:rPr>
+          <w:rFonts w:cstheme="minorHAnsi"/>
+          <w:bCs/>
+          <w:szCs w:val="12"/>
+        </w:rPr>
         <w:t xml:space="preserve"> </w:t>
       </w:r>
       <w:r>
@@ -8195,7 +8092,6 @@
           <w:bCs/>
           <w:szCs w:val="12"/>
         </w:rPr>
-        <w:lastRenderedPageBreak/>
         <w:t xml:space="preserve">circumstances. </w:t>
       </w:r>
       <w:r>
@@ -8204,7 +8100,71 @@
           <w:bCs/>
           <w:szCs w:val="12"/>
         </w:rPr>
-        <w:br/>
+        <w:t xml:space="preserve">The </w:t>
+      </w:r>
+      <w:r>
+        <w:rPr>
+          <w:rFonts w:cstheme="minorHAnsi"/>
+          <w:bCs/>
+          <w:szCs w:val="12"/>
+        </w:rPr>
+        <w:t>v</w:t>
+      </w:r>
+      <w:r>
+        <w:rPr>
+          <w:rFonts w:cstheme="minorHAnsi"/>
+          <w:bCs/>
+          <w:szCs w:val="12"/>
+        </w:rPr>
+        <w:t xml:space="preserve">ariable jitter simulation test clears the networkQueue and sends messages through mockSend with random a random delay per message. It then calls receiveOrdered to wait for all messaged then sorts by sequence number, picks the last payload and asserts that it matches the highest sequence value. </w:t>
+      </w:r>
+      <w:r>
+        <w:rPr>
+          <w:rFonts w:cstheme="minorHAnsi"/>
+          <w:bCs/>
+          <w:szCs w:val="12"/>
+        </w:rPr>
+        <w:t>The packet loss simulation test clears the network Queue and drops a number of messages with 30% probability, retrying until each message arrives. It finally confirms that the final payload is that number multiplied by 100.</w:t>
+      </w:r>
+      <w:r>
+        <w:rPr>
+          <w:rFonts w:cstheme="minorHAnsi"/>
+          <w:bCs/>
+          <w:szCs w:val="12"/>
+        </w:rPr>
+        <w:t xml:space="preserve"> Finally, the replay protection test uses makeChannel to connect a client socket to a server socket. It sends a JSON message where the type includes a message ID prefix and calls recvSecure server-side to read the message and returns true with the stripped JSON </w:t>
+      </w:r>
+      <w:r>
+        <w:rPr>
+          <w:rFonts w:cstheme="minorHAnsi"/>
+          <w:bCs/>
+          <w:szCs w:val="12"/>
+        </w:rPr>
+        <w:t>message and</w:t>
+      </w:r>
+      <w:r>
+        <w:rPr>
+          <w:rFonts w:cstheme="minorHAnsi"/>
+          <w:bCs/>
+          <w:szCs w:val="12"/>
+        </w:rPr>
+        <w:t xml:space="preserve"> sends the same JSON a second time returning false because the message ID is smaller or equal to the first one.</w:t>
+      </w:r>
+      <w:r>
+        <w:rPr>
+          <w:rFonts w:cstheme="minorHAnsi"/>
+          <w:bCs/>
+          <w:szCs w:val="12"/>
+        </w:rPr>
+        <w:t xml:space="preserve"> Replay testing is important because </w:t>
+      </w:r>
+      <w:r>
+        <w:rPr>
+          <w:rFonts w:cstheme="minorHAnsi"/>
+          <w:bCs/>
+          <w:szCs w:val="12"/>
+        </w:rPr>
+        <w:t>it verifies the server-side replay attack prevention and ensures that the lastMessageId is correctly tracked and updated per-client.</w:t>
       </w:r>
     </w:p>
     <w:p>
@@ -8222,6 +8182,7 @@
         <w:rPr>
           <w:rFonts w:asciiTheme="minorHAnsi" w:hAnsiTheme="minorHAnsi" w:cstheme="minorHAnsi"/>
         </w:rPr>
+        <w:lastRenderedPageBreak/>
         <w:t>Results</w:t>
       </w:r>
     </w:p>
@@ -8403,7 +8364,6 @@
           <w:color w:val="auto"/>
           <w:sz w:val="24"/>
           <w:szCs w:val="24"/>
-          <w:lang/>
         </w:rPr>
       </w:pPr>
       <w:r>
@@ -8412,7 +8372,6 @@
           <w:color w:val="auto"/>
           <w:sz w:val="24"/>
           <w:szCs w:val="24"/>
-          <w:lang/>
         </w:rPr>
         <w:t xml:space="preserve">The project set out to design and implement a real-time multiplayer puzzle game using SDL and a client-server architecture, with a focus on responsive gameplay, secure networking, and synchronized game state across clients. Through effective teamwork and iterative development under the Scrum framework, the team successfully delivered a functioning prototype that meets </w:t>
       </w:r>
@@ -8422,7 +8381,6 @@
           <w:color w:val="auto"/>
           <w:sz w:val="24"/>
           <w:szCs w:val="24"/>
-          <w:lang/>
         </w:rPr>
         <w:t>most of</w:t>
       </w:r>
@@ -8432,7 +8390,6 @@
           <w:color w:val="auto"/>
           <w:sz w:val="24"/>
           <w:szCs w:val="24"/>
-          <w:lang/>
         </w:rPr>
         <w:t xml:space="preserve"> the initial requirements.</w:t>
       </w:r>
@@ -8446,7 +8403,6 @@
           <w:color w:val="auto"/>
           <w:sz w:val="24"/>
           <w:szCs w:val="24"/>
-          <w:lang/>
         </w:rPr>
       </w:pPr>
       <w:r>
@@ -8455,7 +8411,6 @@
           <w:color w:val="auto"/>
           <w:sz w:val="24"/>
           <w:szCs w:val="24"/>
-          <w:lang/>
         </w:rPr>
         <w:t>Key achievements include the creation of a drag-and-drop grid-based interface using SDL, a real-time scoring and combo system, and a secure communication protocol based on HMAC validation and timestamped messages. The procedural block generation system ensured fairness by distributing puzzles of equal difficulty to all players. The client-server model allowed for stable synchronization, even under adverse network conditions, while UI feedback and audio cues enhanced the overall player experience.</w:t>
       </w:r>
@@ -8469,7 +8424,6 @@
           <w:color w:val="auto"/>
           <w:sz w:val="24"/>
           <w:szCs w:val="24"/>
-          <w:lang/>
         </w:rPr>
       </w:pPr>
       <w:r>
@@ -8478,7 +8432,6 @@
           <w:color w:val="auto"/>
           <w:sz w:val="24"/>
           <w:szCs w:val="24"/>
-          <w:lang/>
         </w:rPr>
         <w:t>Throughout development, the team encountered and overcame several challenges. These included managing real-time synchronization under variable latency, implementing reliable server discovery, and ensuring that move validation and replay protection were robust against potential exploits. Debugging concurrent client states and refining the drag-and-drop mechanics required careful coordination and repeated testing.</w:t>
       </w:r>
@@ -8501,20 +8454,8 @@
           <w:color w:val="auto"/>
           <w:sz w:val="24"/>
           <w:szCs w:val="24"/>
-          <w:lang/>
-        </w:rPr>
-        <w:t xml:space="preserve">From a learning perspective, the project provided valuable experience in SDL rendering, socket programming, real-time systems, and multiplayer game design. It also reinforced the importance of agile practices, such as sprint-based development, version control discipline, and clear communication. Overall, the team was able to </w:t>
-      </w:r>
-      <w:r>
-        <w:rPr>
-          <w:rFonts w:eastAsia="Times New Roman" w:cstheme="minorHAnsi"/>
-          <w:color w:val="auto"/>
-          <w:sz w:val="24"/>
-          <w:szCs w:val="24"/>
-          <w:lang/>
-        </w:rPr>
-        <w:lastRenderedPageBreak/>
-        <w:t>create a solid foundation for a multiplayer game and gained practical insight into the complexities of building networked interactive systems.</w:t>
+        </w:rPr>
+        <w:t>From a learning perspective, the project provided valuable experience in SDL rendering, socket programming, real-time systems, and multiplayer game design. It also reinforced the importance of agile practices, such as sprint-based development, version control discipline, and clear communication. Overall, the team was able to create a solid foundation for a multiplayer game and gained practical insight into the complexities of building networked interactive systems.</w:t>
       </w:r>
     </w:p>
     <w:p>
@@ -8541,7 +8482,6 @@
           <w:color w:val="auto"/>
           <w:sz w:val="28"/>
           <w:szCs w:val="28"/>
-          <w:lang/>
         </w:rPr>
       </w:pPr>
       <w:r>
@@ -8552,8 +8492,8 @@
           <w:color w:val="auto"/>
           <w:sz w:val="28"/>
           <w:szCs w:val="28"/>
-          <w:lang/>
-        </w:rPr>
+        </w:rPr>
+        <w:lastRenderedPageBreak/>
         <w:t>9.2 Future Work</w:t>
       </w:r>
     </w:p>
@@ -8562,41 +8502,35 @@
         <w:ind w:left="0" w:firstLine="0"/>
         <w:rPr>
           <w:rFonts w:cstheme="minorHAnsi"/>
-          <w:lang/>
-        </w:rPr>
-      </w:pPr>
-      <w:r>
-        <w:rPr>
-          <w:rFonts w:cstheme="minorHAnsi"/>
-          <w:lang/>
+        </w:rPr>
+      </w:pPr>
+      <w:r>
+        <w:rPr>
+          <w:rFonts w:cstheme="minorHAnsi"/>
         </w:rPr>
         <w:t xml:space="preserve">While the current implementation </w:t>
       </w:r>
       <w:r>
         <w:rPr>
           <w:rFonts w:cstheme="minorHAnsi"/>
-          <w:lang/>
         </w:rPr>
         <w:t>already has</w:t>
       </w:r>
       <w:r>
         <w:rPr>
           <w:rFonts w:cstheme="minorHAnsi"/>
-          <w:lang/>
         </w:rPr>
         <w:t xml:space="preserve"> the core objectives of a real-time multiplayer puzzle game, several opportunities exist to</w:t>
       </w:r>
       <w:r>
         <w:rPr>
           <w:rFonts w:cstheme="minorHAnsi"/>
-          <w:lang/>
         </w:rPr>
         <w:t xml:space="preserve"> </w:t>
       </w:r>
       <w:r>
         <w:rPr>
           <w:rFonts w:cstheme="minorHAnsi"/>
-          <w:lang/>
         </w:rPr>
         <w:t>refine the project in future iterations. These include enhancements to gameplay features, user experience, system scalability, and long-term maintainability. The following areas are suggested for future development:</w:t>
       </w:r>
@@ -8608,15 +8542,13 @@
           <w:rFonts w:cstheme="minorHAnsi"/>
           <w:b/>
           <w:bCs/>
-          <w:lang/>
-        </w:rPr>
-      </w:pPr>
-      <w:r>
-        <w:rPr>
-          <w:rFonts w:cstheme="minorHAnsi"/>
-          <w:b/>
-          <w:bCs/>
-          <w:lang/>
+        </w:rPr>
+      </w:pPr>
+      <w:r>
+        <w:rPr>
+          <w:rFonts w:cstheme="minorHAnsi"/>
+          <w:b/>
+          <w:bCs/>
         </w:rPr>
         <w:t>Gameplay Enhancements</w:t>
       </w:r>
@@ -8629,13 +8561,11 @@
         </w:numPr>
         <w:rPr>
           <w:rFonts w:cstheme="minorHAnsi"/>
-          <w:lang/>
-        </w:rPr>
-      </w:pPr>
-      <w:r>
-        <w:rPr>
-          <w:rFonts w:cstheme="minorHAnsi"/>
-          <w:lang/>
+        </w:rPr>
+      </w:pPr>
+      <w:r>
+        <w:rPr>
+          <w:rFonts w:cstheme="minorHAnsi"/>
         </w:rPr>
         <w:t>Implement a single-player mode with local scoring and optional AI opponents.</w:t>
       </w:r>
@@ -8648,13 +8578,11 @@
         </w:numPr>
         <w:rPr>
           <w:rFonts w:cstheme="minorHAnsi"/>
-          <w:lang/>
-        </w:rPr>
-      </w:pPr>
-      <w:r>
-        <w:rPr>
-          <w:rFonts w:cstheme="minorHAnsi"/>
-          <w:lang/>
+        </w:rPr>
+      </w:pPr>
+      <w:r>
+        <w:rPr>
+          <w:rFonts w:cstheme="minorHAnsi"/>
         </w:rPr>
         <w:t>Introduce power-ups, combo bonuses, and unique block types to add strategic depth.</w:t>
       </w:r>
@@ -8667,13 +8595,11 @@
         </w:numPr>
         <w:rPr>
           <w:rFonts w:cstheme="minorHAnsi"/>
-          <w:lang/>
-        </w:rPr>
-      </w:pPr>
-      <w:r>
-        <w:rPr>
-          <w:rFonts w:cstheme="minorHAnsi"/>
-          <w:lang/>
+        </w:rPr>
+      </w:pPr>
+      <w:r>
+        <w:rPr>
+          <w:rFonts w:cstheme="minorHAnsi"/>
         </w:rPr>
         <w:t>Add customizable difficulty settings or puzzle types to support varied play styles.</w:t>
       </w:r>
@@ -8685,15 +8611,13 @@
           <w:rFonts w:cstheme="minorHAnsi"/>
           <w:b/>
           <w:bCs/>
-          <w:lang/>
-        </w:rPr>
-      </w:pPr>
-      <w:r>
-        <w:rPr>
-          <w:rFonts w:cstheme="minorHAnsi"/>
-          <w:b/>
-          <w:bCs/>
-          <w:lang/>
+        </w:rPr>
+      </w:pPr>
+      <w:r>
+        <w:rPr>
+          <w:rFonts w:cstheme="minorHAnsi"/>
+          <w:b/>
+          <w:bCs/>
         </w:rPr>
         <w:t>User Experience Improvements</w:t>
       </w:r>
@@ -8706,13 +8630,11 @@
         </w:numPr>
         <w:rPr>
           <w:rFonts w:cstheme="minorHAnsi"/>
-          <w:lang/>
-        </w:rPr>
-      </w:pPr>
-      <w:r>
-        <w:rPr>
-          <w:rFonts w:cstheme="minorHAnsi"/>
-          <w:lang/>
+        </w:rPr>
+      </w:pPr>
+      <w:r>
+        <w:rPr>
+          <w:rFonts w:cstheme="minorHAnsi"/>
         </w:rPr>
         <w:t>Integrate a tutorial or guided onboarding process for new players.</w:t>
       </w:r>
@@ -8725,13 +8647,11 @@
         </w:numPr>
         <w:rPr>
           <w:rFonts w:cstheme="minorHAnsi"/>
-          <w:lang/>
-        </w:rPr>
-      </w:pPr>
-      <w:r>
-        <w:rPr>
-          <w:rFonts w:cstheme="minorHAnsi"/>
-          <w:lang/>
+        </w:rPr>
+      </w:pPr>
+      <w:r>
+        <w:rPr>
+          <w:rFonts w:cstheme="minorHAnsi"/>
         </w:rPr>
         <w:t>Improve animations, sound effects, and transitions to create a more polished experience.</w:t>
       </w:r>
@@ -8744,13 +8664,11 @@
         </w:numPr>
         <w:rPr>
           <w:rFonts w:cstheme="minorHAnsi"/>
-          <w:lang/>
-        </w:rPr>
-      </w:pPr>
-      <w:r>
-        <w:rPr>
-          <w:rFonts w:cstheme="minorHAnsi"/>
-          <w:lang/>
+        </w:rPr>
+      </w:pPr>
+      <w:r>
+        <w:rPr>
+          <w:rFonts w:cstheme="minorHAnsi"/>
         </w:rPr>
         <w:t>Add accessibility features such as colorblind modes or customizable controls.</w:t>
       </w:r>
@@ -8759,15 +8677,13 @@
       <w:pPr>
         <w:rPr>
           <w:rFonts w:cstheme="minorHAnsi"/>
-          <w:lang/>
-        </w:rPr>
-      </w:pPr>
-      <w:r>
-        <w:rPr>
-          <w:rFonts w:cstheme="minorHAnsi"/>
-          <w:b/>
-          <w:bCs/>
-          <w:lang/>
+        </w:rPr>
+      </w:pPr>
+      <w:r>
+        <w:rPr>
+          <w:rFonts w:cstheme="minorHAnsi"/>
+          <w:b/>
+          <w:bCs/>
         </w:rPr>
         <w:t>Backend &amp; Networking Improvements</w:t>
       </w:r>
@@ -8780,13 +8696,11 @@
         </w:numPr>
         <w:rPr>
           <w:rFonts w:cstheme="minorHAnsi"/>
-          <w:lang/>
-        </w:rPr>
-      </w:pPr>
-      <w:r>
-        <w:rPr>
-          <w:rFonts w:cstheme="minorHAnsi"/>
-          <w:lang/>
+        </w:rPr>
+      </w:pPr>
+      <w:r>
+        <w:rPr>
+          <w:rFonts w:cstheme="minorHAnsi"/>
         </w:rPr>
         <w:t>Optimize server performance to support larger numbers of concurrent players.</w:t>
       </w:r>
@@ -8799,13 +8713,11 @@
         </w:numPr>
         <w:rPr>
           <w:rFonts w:cstheme="minorHAnsi"/>
-          <w:lang/>
-        </w:rPr>
-      </w:pPr>
-      <w:r>
-        <w:rPr>
-          <w:rFonts w:cstheme="minorHAnsi"/>
-          <w:lang/>
+        </w:rPr>
+      </w:pPr>
+      <w:r>
+        <w:rPr>
+          <w:rFonts w:cstheme="minorHAnsi"/>
         </w:rPr>
         <w:t>Implement a matchmaking queue and ranking system for competitive play.</w:t>
       </w:r>
@@ -8818,13 +8730,11 @@
         </w:numPr>
         <w:rPr>
           <w:rFonts w:cstheme="minorHAnsi"/>
-          <w:lang/>
-        </w:rPr>
-      </w:pPr>
-      <w:r>
-        <w:rPr>
-          <w:rFonts w:cstheme="minorHAnsi"/>
-          <w:lang/>
+        </w:rPr>
+      </w:pPr>
+      <w:r>
+        <w:rPr>
+          <w:rFonts w:cstheme="minorHAnsi"/>
         </w:rPr>
         <w:t>Add persistent user profiles and statistics stored in a backend database.</w:t>
       </w:r>
@@ -8836,15 +8746,13 @@
           <w:rFonts w:cstheme="minorHAnsi"/>
           <w:b/>
           <w:bCs/>
-          <w:lang/>
-        </w:rPr>
-      </w:pPr>
-      <w:r>
-        <w:rPr>
-          <w:rFonts w:cstheme="minorHAnsi"/>
-          <w:b/>
-          <w:bCs/>
-          <w:lang/>
+        </w:rPr>
+      </w:pPr>
+      <w:r>
+        <w:rPr>
+          <w:rFonts w:cstheme="minorHAnsi"/>
+          <w:b/>
+          <w:bCs/>
         </w:rPr>
         <w:t>Robust Testing and Analytics</w:t>
       </w:r>
@@ -8857,13 +8765,11 @@
         </w:numPr>
         <w:rPr>
           <w:rFonts w:cstheme="minorHAnsi"/>
-          <w:lang/>
-        </w:rPr>
-      </w:pPr>
-      <w:r>
-        <w:rPr>
-          <w:rFonts w:cstheme="minorHAnsi"/>
-          <w:lang/>
+        </w:rPr>
+      </w:pPr>
+      <w:r>
+        <w:rPr>
+          <w:rFonts w:cstheme="minorHAnsi"/>
         </w:rPr>
         <w:t>Develop more comprehensive automated testing pipelines.</w:t>
       </w:r>
@@ -8876,13 +8782,11 @@
         </w:numPr>
         <w:rPr>
           <w:rFonts w:cstheme="minorHAnsi"/>
-          <w:lang/>
-        </w:rPr>
-      </w:pPr>
-      <w:r>
-        <w:rPr>
-          <w:rFonts w:cstheme="minorHAnsi"/>
-          <w:lang/>
+        </w:rPr>
+      </w:pPr>
+      <w:r>
+        <w:rPr>
+          <w:rFonts w:cstheme="minorHAnsi"/>
         </w:rPr>
         <w:t>Incorporate analytics to track player behavior and inform future game balance.</w:t>
       </w:r>
@@ -8895,13 +8799,11 @@
         </w:numPr>
         <w:rPr>
           <w:rFonts w:cstheme="minorHAnsi"/>
-          <w:lang/>
-        </w:rPr>
-      </w:pPr>
-      <w:r>
-        <w:rPr>
-          <w:rFonts w:cstheme="minorHAnsi"/>
-          <w:lang/>
+        </w:rPr>
+      </w:pPr>
+      <w:r>
+        <w:rPr>
+          <w:rFonts w:cstheme="minorHAnsi"/>
         </w:rPr>
         <w:t>Simulate a wider range of network conditions to further improve robustness.</w:t>
       </w:r>
@@ -8913,15 +8815,13 @@
           <w:rFonts w:cstheme="minorHAnsi"/>
           <w:b/>
           <w:bCs/>
-          <w:lang/>
-        </w:rPr>
-      </w:pPr>
-      <w:r>
-        <w:rPr>
-          <w:rFonts w:cstheme="minorHAnsi"/>
-          <w:b/>
-          <w:bCs/>
-          <w:lang/>
+        </w:rPr>
+      </w:pPr>
+      <w:r>
+        <w:rPr>
+          <w:rFonts w:cstheme="minorHAnsi"/>
+          <w:b/>
+          <w:bCs/>
         </w:rPr>
         <w:t>Extensibility and Modding Support</w:t>
       </w:r>
@@ -8934,13 +8834,11 @@
         </w:numPr>
         <w:rPr>
           <w:rFonts w:cstheme="minorHAnsi"/>
-          <w:lang/>
-        </w:rPr>
-      </w:pPr>
-      <w:r>
-        <w:rPr>
-          <w:rFonts w:cstheme="minorHAnsi"/>
-          <w:lang/>
+        </w:rPr>
+      </w:pPr>
+      <w:r>
+        <w:rPr>
+          <w:rFonts w:cstheme="minorHAnsi"/>
         </w:rPr>
         <w:t>Provide tools or APIs to allow user-generated puzzles or custom game modes.</w:t>
       </w:r>
@@ -8953,13 +8851,11 @@
         </w:numPr>
         <w:rPr>
           <w:rFonts w:cstheme="minorHAnsi"/>
-          <w:lang/>
-        </w:rPr>
-      </w:pPr>
-      <w:r>
-        <w:rPr>
-          <w:rFonts w:cstheme="minorHAnsi"/>
-          <w:lang/>
+        </w:rPr>
+      </w:pPr>
+      <w:r>
+        <w:rPr>
+          <w:rFonts w:cstheme="minorHAnsi"/>
         </w:rPr>
         <w:t>Create a level editor for building and sharing custom challenges.</w:t>
       </w:r>
@@ -8972,13 +8868,11 @@
         </w:numPr>
         <w:rPr>
           <w:rFonts w:cstheme="minorHAnsi"/>
-          <w:lang/>
-        </w:rPr>
-      </w:pPr>
-      <w:r>
-        <w:rPr>
-          <w:rFonts w:cstheme="minorHAnsi"/>
-          <w:lang/>
+        </w:rPr>
+      </w:pPr>
+      <w:r>
+        <w:rPr>
+          <w:rFonts w:cstheme="minorHAnsi"/>
         </w:rPr>
         <w:t>Consider releasing the project as open source to encourage community contributions.</w:t>
       </w:r>
@@ -8990,15 +8884,13 @@
           <w:rFonts w:cstheme="minorHAnsi"/>
           <w:b/>
           <w:bCs/>
-          <w:lang/>
-        </w:rPr>
-      </w:pPr>
-      <w:r>
-        <w:rPr>
-          <w:rFonts w:cstheme="minorHAnsi"/>
-          <w:b/>
-          <w:bCs/>
-          <w:lang/>
+        </w:rPr>
+      </w:pPr>
+      <w:r>
+        <w:rPr>
+          <w:rFonts w:cstheme="minorHAnsi"/>
+          <w:b/>
+          <w:bCs/>
         </w:rPr>
         <w:t>Platform Expansion</w:t>
       </w:r>
@@ -9011,13 +8903,11 @@
         </w:numPr>
         <w:rPr>
           <w:rFonts w:cstheme="minorHAnsi"/>
-          <w:lang/>
-        </w:rPr>
-      </w:pPr>
-      <w:r>
-        <w:rPr>
-          <w:rFonts w:cstheme="minorHAnsi"/>
-          <w:lang/>
+        </w:rPr>
+      </w:pPr>
+      <w:r>
+        <w:rPr>
+          <w:rFonts w:cstheme="minorHAnsi"/>
         </w:rPr>
         <w:t>Port the game to mobile or web platforms for broader accessibility.</w:t>
       </w:r>
@@ -9030,13 +8920,11 @@
         </w:numPr>
         <w:rPr>
           <w:rFonts w:cstheme="minorHAnsi"/>
-          <w:lang/>
-        </w:rPr>
-      </w:pPr>
-      <w:r>
-        <w:rPr>
-          <w:rFonts w:cstheme="minorHAnsi"/>
-          <w:lang/>
+        </w:rPr>
+      </w:pPr>
+      <w:r>
+        <w:rPr>
+          <w:rFonts w:cstheme="minorHAnsi"/>
         </w:rPr>
         <w:t>Add controller support and local co-op for expanded play modes.</w:t>
       </w:r>
@@ -9045,7 +8933,6 @@
       <w:pPr>
         <w:rPr>
           <w:rFonts w:cstheme="minorHAnsi"/>
-          <w:lang/>
         </w:rPr>
       </w:pPr>
     </w:p>
@@ -9054,13 +8941,11 @@
         <w:ind w:left="0" w:firstLine="0"/>
         <w:rPr>
           <w:rFonts w:cstheme="minorHAnsi"/>
-          <w:lang/>
-        </w:rPr>
-      </w:pPr>
-      <w:r>
-        <w:rPr>
-          <w:rFonts w:cstheme="minorHAnsi"/>
-          <w:lang/>
+        </w:rPr>
+      </w:pPr>
+      <w:r>
+        <w:rPr>
+          <w:rFonts w:cstheme="minorHAnsi"/>
         </w:rPr>
         <w:t>By addressing these areas, the game can evolve into a more feature-rich, accessible, and scalable product with long-term appeal and community engagement.</w:t>
       </w:r>
@@ -9082,6 +8967,7 @@
         <w:rPr>
           <w:rFonts w:asciiTheme="minorHAnsi" w:hAnsiTheme="minorHAnsi" w:cstheme="minorHAnsi"/>
         </w:rPr>
+        <w:lastRenderedPageBreak/>
         <w:t>10. A</w:t>
       </w:r>
       <w:r>
@@ -16610,6 +16496,7 @@
   <w:style w:type="character" w:default="1" w:styleId="DefaultParagraphFont">
     <w:name w:val="Default Paragraph Font"/>
     <w:uiPriority w:val="1"/>
+    <w:semiHidden/>
     <w:unhideWhenUsed/>
   </w:style>
   <w:style w:type="table" w:default="1" w:styleId="TableNormal">

</xml_diff>